<commit_message>
Remove unnecessary Repository Count section from RFP
Co-Authored-By: Claude Opus 4.6 <noreply@anthropic.com>
</commit_message>
<xml_diff>
--- a/GitLab_OnPrem_Deployment_RFP.docx
+++ b/GitLab_OnPrem_Deployment_RFP.docx
@@ -654,7 +654,7 @@
     </w:p>
     <w:bookmarkEnd w:id="12"/>
     <w:bookmarkEnd w:id="13"/>
-    <w:bookmarkStart w:id="18" w:name="organization-overview"/>
+    <w:bookmarkStart w:id="17" w:name="organization-overview"/>
     <w:p>
       <w:pPr>
         <w:pStyle w:val="Heading1"/>
@@ -883,110 +883,8 @@
       </w:tr>
     </w:tbl>
     <w:bookmarkEnd w:id="16"/>
-    <w:bookmarkStart w:id="17" w:name="repository-count"/>
-    <w:p>
-      <w:pPr>
-        <w:pStyle w:val="Heading2"/>
-      </w:pPr>
-      <w:r>
-        <w:t xml:space="preserve">2.4 Repository Count</w:t>
-      </w:r>
-    </w:p>
-    <w:tbl>
-      <w:tblPr>
-        <w:tblStyle w:val="Table"/>
-        <w:tblW w:type="auto" w:w="0"/>
-        <w:tblLook w:firstRow="1" w:lastRow="0" w:firstColumn="0" w:lastColumn="0" w:noHBand="0" w:noVBand="0" w:val="0020"/>
-      </w:tblPr>
-      <w:tblGrid>
-        <w:gridCol w:w="3960"/>
-        <w:gridCol w:w="3960"/>
-      </w:tblGrid>
-      <w:tr>
-        <w:trPr>
-          <w:tblHeader w:val="on"/>
-        </w:trPr>
-        <w:tc>
-          <w:tcPr/>
-          <w:p>
-            <w:pPr>
-              <w:pStyle w:val="Compact"/>
-              <w:jc w:val="left"/>
-            </w:pPr>
-            <w:r>
-              <w:t xml:space="preserve">Type</w:t>
-            </w:r>
-          </w:p>
-        </w:tc>
-        <w:tc>
-          <w:tcPr/>
-          <w:p>
-            <w:pPr>
-              <w:pStyle w:val="Compact"/>
-              <w:jc w:val="right"/>
-            </w:pPr>
-            <w:r>
-              <w:t xml:space="preserve">Estimated Count</w:t>
-            </w:r>
-          </w:p>
-        </w:tc>
-      </w:tr>
-      <w:tr>
-        <w:tc>
-          <w:tcPr/>
-          <w:p>
-            <w:pPr>
-              <w:pStyle w:val="Compact"/>
-              <w:jc w:val="left"/>
-            </w:pPr>
-            <w:r>
-              <w:t xml:space="preserve">Active Repositories</w:t>
-            </w:r>
-          </w:p>
-        </w:tc>
-        <w:tc>
-          <w:tcPr/>
-          <w:p>
-            <w:pPr>
-              <w:pStyle w:val="Compact"/>
-              <w:jc w:val="right"/>
-            </w:pPr>
-            <w:r>
-              <w:t xml:space="preserve">[Number]</w:t>
-            </w:r>
-          </w:p>
-        </w:tc>
-      </w:tr>
-      <w:tr>
-        <w:tc>
-          <w:tcPr/>
-          <w:p>
-            <w:pPr>
-              <w:pStyle w:val="Compact"/>
-              <w:jc w:val="left"/>
-            </w:pPr>
-            <w:r>
-              <w:t xml:space="preserve">Archived Repositories</w:t>
-            </w:r>
-          </w:p>
-        </w:tc>
-        <w:tc>
-          <w:tcPr/>
-          <w:p>
-            <w:pPr>
-              <w:pStyle w:val="Compact"/>
-              <w:jc w:val="right"/>
-            </w:pPr>
-            <w:r>
-              <w:t xml:space="preserve">[Number]</w:t>
-            </w:r>
-          </w:p>
-        </w:tc>
-      </w:tr>
-    </w:tbl>
     <w:bookmarkEnd w:id="17"/>
-    <w:bookmarkEnd w:id="18"/>
-    <w:bookmarkStart w:id="38" w:name="scope-of-work"/>
+    <w:bookmarkStart w:id="37" w:name="scope-of-work"/>
     <w:p>
       <w:pPr>
         <w:pStyle w:val="Heading1"/>
@@ -1003,7 +901,7 @@
         <w:t xml:space="preserve">The vendor shall deliver all items listed below. Each deliverable includes a priority level indicating its criticality to the project.</w:t>
       </w:r>
     </w:p>
-    <w:bookmarkStart w:id="19" w:name="deliverables-summary"/>
+    <w:bookmarkStart w:id="18" w:name="deliverables-summary"/>
     <w:p>
       <w:pPr>
         <w:pStyle w:val="Heading2"/>
@@ -1635,8 +1533,8 @@
         </w:tc>
       </w:tr>
     </w:tbl>
-    <w:bookmarkEnd w:id="19"/>
-    <w:bookmarkStart w:id="20" w:name="server-provisioning-docker-setup"/>
+    <w:bookmarkEnd w:id="18"/>
+    <w:bookmarkStart w:id="19" w:name="server-provisioning-docker-setup"/>
     <w:p>
       <w:pPr>
         <w:pStyle w:val="Heading2"/>
@@ -1839,8 +1737,8 @@
         <w:t xml:space="preserve">Configure Docker log rotation to prevent disk exhaustion</w:t>
       </w:r>
     </w:p>
-    <w:bookmarkEnd w:id="20"/>
-    <w:bookmarkStart w:id="21" w:name="gitlab-premium-deployment"/>
+    <w:bookmarkEnd w:id="19"/>
+    <w:bookmarkStart w:id="20" w:name="gitlab-premium-deployment"/>
     <w:p>
       <w:pPr>
         <w:pStyle w:val="Heading2"/>
@@ -2010,8 +1908,8 @@
         <w:t xml:space="preserve">Verify GitLab web interface is accessible</w:t>
       </w:r>
     </w:p>
-    <w:bookmarkEnd w:id="21"/>
-    <w:bookmarkStart w:id="22" w:name="ssltls-certificate-setup"/>
+    <w:bookmarkEnd w:id="20"/>
+    <w:bookmarkStart w:id="21" w:name="ssltls-certificate-setup"/>
     <w:p>
       <w:pPr>
         <w:pStyle w:val="Heading2"/>
@@ -2155,8 +2053,8 @@
         <w:t xml:space="preserve">Ensure no browser warnings when accessing the GitLab URL</w:t>
       </w:r>
     </w:p>
-    <w:bookmarkEnd w:id="22"/>
-    <w:bookmarkStart w:id="23" w:name="https-ssh-configuration"/>
+    <w:bookmarkEnd w:id="21"/>
+    <w:bookmarkStart w:id="22" w:name="https-ssh-configuration"/>
     <w:p>
       <w:pPr>
         <w:pStyle w:val="Heading2"/>
@@ -2281,8 +2179,8 @@
         <w:t xml:space="preserve">Verify both HTTPS and SSH access work correctly</w:t>
       </w:r>
     </w:p>
-    <w:bookmarkEnd w:id="23"/>
-    <w:bookmarkStart w:id="24" w:name="microsoft-entra-id-sso-oidc"/>
+    <w:bookmarkEnd w:id="22"/>
+    <w:bookmarkStart w:id="23" w:name="microsoft-entra-id-sso-oidc"/>
     <w:p>
       <w:pPr>
         <w:pStyle w:val="Heading2"/>
@@ -2557,8 +2455,8 @@
         <w:t xml:space="preserve">Configure group-level SAML SSO (Premium feature)</w:t>
       </w:r>
     </w:p>
-    <w:bookmarkEnd w:id="24"/>
-    <w:bookmarkStart w:id="25" w:name="smtp-email-configuration"/>
+    <w:bookmarkEnd w:id="23"/>
+    <w:bookmarkStart w:id="24" w:name="smtp-email-configuration"/>
     <w:p>
       <w:pPr>
         <w:pStyle w:val="Heading2"/>
@@ -2657,8 +2555,8 @@
         <w:t xml:space="preserve">Verify notification emails for merge requests, issues, and pipeline events</w:t>
       </w:r>
     </w:p>
-    <w:bookmarkEnd w:id="25"/>
-    <w:bookmarkStart w:id="26" w:name="firewall-configuration"/>
+    <w:bookmarkEnd w:id="24"/>
+    <w:bookmarkStart w:id="25" w:name="firewall-configuration"/>
     <w:p>
       <w:pPr>
         <w:pStyle w:val="Heading2"/>
@@ -2789,8 +2687,8 @@
         <w:t xml:space="preserve">Verify connectivity from client machines to all three ports</w:t>
       </w:r>
     </w:p>
-    <w:bookmarkEnd w:id="26"/>
-    <w:bookmarkStart w:id="27" w:name="backup-strategy-automation"/>
+    <w:bookmarkEnd w:id="25"/>
+    <w:bookmarkStart w:id="26" w:name="backup-strategy-automation"/>
     <w:p>
       <w:pPr>
         <w:pStyle w:val="Heading2"/>
@@ -3010,8 +2908,8 @@
         <w:t xml:space="preserve">Document the backup and restore procedures</w:t>
       </w:r>
     </w:p>
-    <w:bookmarkEnd w:id="27"/>
-    <w:bookmarkStart w:id="28" w:name="monitoring-integration"/>
+    <w:bookmarkEnd w:id="26"/>
+    <w:bookmarkStart w:id="27" w:name="monitoring-integration"/>
     <w:p>
       <w:pPr>
         <w:pStyle w:val="Heading2"/>
@@ -3231,8 +3129,8 @@
         <w:t xml:space="preserve">Verify alert notifications are delivered correctly</w:t>
       </w:r>
     </w:p>
-    <w:bookmarkEnd w:id="28"/>
-    <w:bookmarkStart w:id="29" w:name="user-group-management"/>
+    <w:bookmarkEnd w:id="27"/>
+    <w:bookmarkStart w:id="28" w:name="user-group-management"/>
     <w:p>
       <w:pPr>
         <w:pStyle w:val="Heading2"/>
@@ -3583,8 +3481,8 @@
         <w:t xml:space="preserve">for critical repositories</w:t>
       </w:r>
     </w:p>
-    <w:bookmarkEnd w:id="29"/>
-    <w:bookmarkStart w:id="30" w:name="github-repository-migration"/>
+    <w:bookmarkEnd w:id="28"/>
+    <w:bookmarkStart w:id="29" w:name="github-repository-migration"/>
     <w:p>
       <w:pPr>
         <w:pStyle w:val="Heading2"/>
@@ -3698,8 +3596,8 @@
         <w:t xml:space="preserve">Document the migration process and results</w:t>
       </w:r>
     </w:p>
-    <w:bookmarkEnd w:id="30"/>
-    <w:bookmarkStart w:id="31" w:name="source-of-truth-sync-strategy"/>
+    <w:bookmarkEnd w:id="29"/>
+    <w:bookmarkStart w:id="30" w:name="source-of-truth-sync-strategy"/>
     <w:p>
       <w:pPr>
         <w:pStyle w:val="Heading2"/>
@@ -3852,8 +3750,8 @@
         <w:t xml:space="preserve">(Premium feature) as an alternative to manual sync scripts</w:t>
       </w:r>
     </w:p>
-    <w:bookmarkEnd w:id="31"/>
-    <w:bookmarkStart w:id="35" w:name="gitlab-premium-license-activation"/>
+    <w:bookmarkEnd w:id="30"/>
+    <w:bookmarkStart w:id="34" w:name="gitlab-premium-license-activation"/>
     <w:p>
       <w:pPr>
         <w:pStyle w:val="Heading2"/>
@@ -3870,7 +3768,7 @@
         <w:t xml:space="preserve">Procure and activate the GitLab Premium license:</w:t>
       </w:r>
     </w:p>
-    <w:bookmarkStart w:id="32" w:name="license-details"/>
+    <w:bookmarkStart w:id="31" w:name="license-details"/>
     <w:p>
       <w:pPr>
         <w:pStyle w:val="Heading3"/>
@@ -4032,8 +3930,8 @@
         </w:tc>
       </w:tr>
     </w:tbl>
-    <w:bookmarkEnd w:id="32"/>
-    <w:bookmarkStart w:id="33" w:name="premium-features-to-configure"/>
+    <w:bookmarkEnd w:id="31"/>
+    <w:bookmarkStart w:id="32" w:name="premium-features-to-configure"/>
     <w:p>
       <w:pPr>
         <w:pStyle w:val="Heading3"/>
@@ -4370,8 +4268,8 @@
         </w:tc>
       </w:tr>
     </w:tbl>
-    <w:bookmarkEnd w:id="33"/>
-    <w:bookmarkStart w:id="34" w:name="license-installation"/>
+    <w:bookmarkEnd w:id="32"/>
+    <w:bookmarkStart w:id="33" w:name="license-installation"/>
     <w:p>
       <w:pPr>
         <w:pStyle w:val="Heading3"/>
@@ -4480,9 +4378,9 @@
         <w:t xml:space="preserve">Verify Premium features are unlocked in the admin panel</w:t>
       </w:r>
     </w:p>
+    <w:bookmarkEnd w:id="33"/>
     <w:bookmarkEnd w:id="34"/>
-    <w:bookmarkEnd w:id="35"/>
-    <w:bookmarkStart w:id="36" w:name="documentation-sop"/>
+    <w:bookmarkStart w:id="35" w:name="documentation-sop"/>
     <w:p>
       <w:pPr>
         <w:pStyle w:val="Heading2"/>
@@ -4629,8 +4527,8 @@
         <w:t xml:space="preserve">SOP must be detailed enough for the IT team to reproduce the deployment independently</w:t>
       </w:r>
     </w:p>
-    <w:bookmarkEnd w:id="36"/>
-    <w:bookmarkStart w:id="37" w:name="knowledge-transfer-training"/>
+    <w:bookmarkEnd w:id="35"/>
+    <w:bookmarkStart w:id="36" w:name="knowledge-transfer-training"/>
     <w:p>
       <w:pPr>
         <w:pStyle w:val="Heading2"/>
@@ -4737,9 +4635,9 @@
         <w:t xml:space="preserve">All sessions to be recorded for future reference</w:t>
       </w:r>
     </w:p>
+    <w:bookmarkEnd w:id="36"/>
     <w:bookmarkEnd w:id="37"/>
-    <w:bookmarkEnd w:id="38"/>
-    <w:bookmarkStart w:id="39" w:name="technical-requirements"/>
+    <w:bookmarkStart w:id="38" w:name="technical-requirements"/>
     <w:p>
       <w:pPr>
         <w:pStyle w:val="Heading1"/>
@@ -5266,8 +5164,8 @@
         </w:tc>
       </w:tr>
     </w:tbl>
-    <w:bookmarkEnd w:id="39"/>
-    <w:bookmarkStart w:id="40" w:name="security-requirements"/>
+    <w:bookmarkEnd w:id="38"/>
+    <w:bookmarkStart w:id="39" w:name="security-requirements"/>
     <w:p>
       <w:pPr>
         <w:pStyle w:val="Heading1"/>
@@ -5746,8 +5644,8 @@
         </w:tc>
       </w:tr>
     </w:tbl>
-    <w:bookmarkEnd w:id="40"/>
-    <w:bookmarkStart w:id="41" w:name="acceptance-criteria"/>
+    <w:bookmarkEnd w:id="39"/>
+    <w:bookmarkStart w:id="40" w:name="acceptance-criteria"/>
     <w:p>
       <w:pPr>
         <w:pStyle w:val="Heading1"/>
@@ -6590,8 +6488,8 @@
         </w:tc>
       </w:tr>
     </w:tbl>
-    <w:bookmarkEnd w:id="41"/>
-    <w:bookmarkStart w:id="43" w:name="timeline-milestones"/>
+    <w:bookmarkEnd w:id="40"/>
+    <w:bookmarkStart w:id="42" w:name="timeline-milestones"/>
     <w:p>
       <w:pPr>
         <w:pStyle w:val="Heading1"/>
@@ -6991,7 +6889,7 @@
         </w:tc>
       </w:tr>
     </w:tbl>
-    <w:bookmarkStart w:id="42" w:name="milestone-review"/>
+    <w:bookmarkStart w:id="41" w:name="milestone-review"/>
     <w:p>
       <w:pPr>
         <w:pStyle w:val="Heading3"/>
@@ -7008,9 +6906,9 @@
         <w:t xml:space="preserve">At the end of each phase, a milestone review meeting shall be conducted to verify deliverables and approve progression to the next phase.</w:t>
       </w:r>
     </w:p>
+    <w:bookmarkEnd w:id="41"/>
     <w:bookmarkEnd w:id="42"/>
-    <w:bookmarkEnd w:id="43"/>
-    <w:bookmarkStart w:id="44" w:name="vendor-requirements"/>
+    <w:bookmarkStart w:id="43" w:name="vendor-requirements"/>
     <w:p>
       <w:pPr>
         <w:pStyle w:val="Heading1"/>
@@ -7362,8 +7260,8 @@
         </w:tc>
       </w:tr>
     </w:tbl>
-    <w:bookmarkEnd w:id="44"/>
-    <w:bookmarkStart w:id="46" w:name="proposal-submission-requirements"/>
+    <w:bookmarkEnd w:id="43"/>
+    <w:bookmarkStart w:id="45" w:name="proposal-submission-requirements"/>
     <w:p>
       <w:pPr>
         <w:pStyle w:val="Heading1"/>
@@ -7662,7 +7560,7 @@
         </w:tc>
       </w:tr>
     </w:tbl>
-    <w:bookmarkStart w:id="45" w:name="submission-format"/>
+    <w:bookmarkStart w:id="44" w:name="submission-format"/>
     <w:p>
       <w:pPr>
         <w:pStyle w:val="Heading3"/>
@@ -7759,9 +7657,9 @@
         <w:t xml:space="preserve">[Deadline Date]</w:t>
       </w:r>
     </w:p>
+    <w:bookmarkEnd w:id="44"/>
     <w:bookmarkEnd w:id="45"/>
-    <w:bookmarkEnd w:id="46"/>
-    <w:bookmarkStart w:id="48" w:name="evaluation-criteria"/>
+    <w:bookmarkStart w:id="47" w:name="evaluation-criteria"/>
     <w:p>
       <w:pPr>
         <w:pStyle w:val="Heading1"/>
@@ -8095,7 +7993,7 @@
         </w:tc>
       </w:tr>
     </w:tbl>
-    <w:bookmarkStart w:id="47" w:name="evaluation-process"/>
+    <w:bookmarkStart w:id="46" w:name="evaluation-process"/>
     <w:p>
       <w:pPr>
         <w:pStyle w:val="Heading3"/>
@@ -8214,9 +8112,9 @@
         <w:t xml:space="preserve">— Combined scoring and recommendation</w:t>
       </w:r>
     </w:p>
+    <w:bookmarkEnd w:id="46"/>
     <w:bookmarkEnd w:id="47"/>
-    <w:bookmarkEnd w:id="48"/>
-    <w:bookmarkStart w:id="54" w:name="terms-conditions"/>
+    <w:bookmarkStart w:id="53" w:name="terms-conditions"/>
     <w:p>
       <w:pPr>
         <w:pStyle w:val="Heading1"/>
@@ -8225,7 +8123,7 @@
         <w:t xml:space="preserve">11. Terms &amp; Conditions</w:t>
       </w:r>
     </w:p>
-    <w:bookmarkStart w:id="49" w:name="confidentiality"/>
+    <w:bookmarkStart w:id="48" w:name="confidentiality"/>
     <w:p>
       <w:pPr>
         <w:pStyle w:val="Heading2"/>
@@ -8255,8 +8153,8 @@
         <w:t xml:space="preserve">. The vendor must not disclose any information to third parties without written consent from the organization.</w:t>
       </w:r>
     </w:p>
-    <w:bookmarkEnd w:id="49"/>
-    <w:bookmarkStart w:id="50" w:name="intellectual-property"/>
+    <w:bookmarkEnd w:id="48"/>
+    <w:bookmarkStart w:id="49" w:name="intellectual-property"/>
     <w:p>
       <w:pPr>
         <w:pStyle w:val="Heading2"/>
@@ -8299,8 +8197,8 @@
         <w:t xml:space="preserve">The vendor retains no rights to the deliverables after project completion</w:t>
       </w:r>
     </w:p>
-    <w:bookmarkEnd w:id="50"/>
-    <w:bookmarkStart w:id="51" w:name="warranty-period"/>
+    <w:bookmarkEnd w:id="49"/>
+    <w:bookmarkStart w:id="50" w:name="warranty-period"/>
     <w:p>
       <w:pPr>
         <w:pStyle w:val="Heading2"/>
@@ -8357,8 +8255,8 @@
         <w:t xml:space="preserve">Provide remote support for troubleshooting</w:t>
       </w:r>
     </w:p>
-    <w:bookmarkEnd w:id="51"/>
-    <w:bookmarkStart w:id="52" w:name="post-deployment-support"/>
+    <w:bookmarkEnd w:id="50"/>
+    <w:bookmarkStart w:id="51" w:name="post-deployment-support"/>
     <w:p>
       <w:pPr>
         <w:pStyle w:val="Heading2"/>
@@ -8596,43 +8494,43 @@
         </w:tc>
       </w:tr>
     </w:tbl>
+    <w:bookmarkEnd w:id="51"/>
+    <w:bookmarkStart w:id="52" w:name="payment-terms"/>
+    <w:p>
+      <w:pPr>
+        <w:pStyle w:val="Heading2"/>
+      </w:pPr>
+      <w:r>
+        <w:t xml:space="preserve">11.5 Payment Terms</w:t>
+      </w:r>
+    </w:p>
+    <w:p>
+      <w:pPr>
+        <w:pStyle w:val="Compact"/>
+        <w:numPr>
+          <w:ilvl w:val="0"/>
+          <w:numId w:val="1036"/>
+        </w:numPr>
+      </w:pPr>
+      <w:r>
+        <w:t xml:space="preserve">Payment schedule tied to milestone completion and acceptance</w:t>
+      </w:r>
+    </w:p>
+    <w:p>
+      <w:pPr>
+        <w:pStyle w:val="Compact"/>
+        <w:numPr>
+          <w:ilvl w:val="0"/>
+          <w:numId w:val="1036"/>
+        </w:numPr>
+      </w:pPr>
+      <w:r>
+        <w:t xml:space="preserve">Final payment upon completion of all acceptance criteria and knowledge transfer</w:t>
+      </w:r>
+    </w:p>
     <w:bookmarkEnd w:id="52"/>
-    <w:bookmarkStart w:id="53" w:name="payment-terms"/>
-    <w:p>
-      <w:pPr>
-        <w:pStyle w:val="Heading2"/>
-      </w:pPr>
-      <w:r>
-        <w:t xml:space="preserve">11.5 Payment Terms</w:t>
-      </w:r>
-    </w:p>
-    <w:p>
-      <w:pPr>
-        <w:pStyle w:val="Compact"/>
-        <w:numPr>
-          <w:ilvl w:val="0"/>
-          <w:numId w:val="1036"/>
-        </w:numPr>
-      </w:pPr>
-      <w:r>
-        <w:t xml:space="preserve">Payment schedule tied to milestone completion and acceptance</w:t>
-      </w:r>
-    </w:p>
-    <w:p>
-      <w:pPr>
-        <w:pStyle w:val="Compact"/>
-        <w:numPr>
-          <w:ilvl w:val="0"/>
-          <w:numId w:val="1036"/>
-        </w:numPr>
-      </w:pPr>
-      <w:r>
-        <w:t xml:space="preserve">Final payment upon completion of all acceptance criteria and knowledge transfer</w:t>
-      </w:r>
-    </w:p>
     <w:bookmarkEnd w:id="53"/>
-    <w:bookmarkEnd w:id="54"/>
-    <w:bookmarkStart w:id="55" w:name="sign-off"/>
+    <w:bookmarkStart w:id="54" w:name="sign-off"/>
     <w:p>
       <w:pPr>
         <w:pStyle w:val="Heading1"/>
@@ -8890,7 +8788,7 @@
         <w:t xml:space="preserve">RFP Reference: RFP-GITLAB-2026-001 — Version 1.0</w:t>
       </w:r>
     </w:p>
-    <w:bookmarkEnd w:id="55"/>
+    <w:bookmarkEnd w:id="54"/>
     <w:sectPr>
       <w:footnotePr>
         <w:numRestart w:val="eachSect"/>
@@ -10046,7 +9944,6 @@
     <w:link w:val="VerbatimChar"/>
     <w:pPr>
       <w:wordWrap w:val="off"/>
-      <w:shd w:val="clear" w:fill="f8f8f8"/>
     </w:pPr>
   </w:style>
   <w:style w:type="character" w:customStyle="1" w:styleId="KeywordTok">
@@ -10054,96 +9951,85 @@
     <w:basedOn w:val="VerbatimChar"/>
     <w:rPr>
       <w:b/>
-      <w:color w:val="204a87"/>
-      <w:shd w:val="clear" w:fill="f8f8f8"/>
+      <w:color w:val="007020"/>
     </w:rPr>
   </w:style>
   <w:style w:type="character" w:customStyle="1" w:styleId="DataTypeTok">
     <w:name w:val="DataTypeTok"/>
     <w:basedOn w:val="VerbatimChar"/>
     <w:rPr>
-      <w:color w:val="204a87"/>
-      <w:shd w:val="clear" w:fill="f8f8f8"/>
+      <w:color w:val="902000"/>
     </w:rPr>
   </w:style>
   <w:style w:type="character" w:customStyle="1" w:styleId="DecValTok">
     <w:name w:val="DecValTok"/>
     <w:basedOn w:val="VerbatimChar"/>
     <w:rPr>
-      <w:color w:val="0000cf"/>
-      <w:shd w:val="clear" w:fill="f8f8f8"/>
+      <w:color w:val="40a070"/>
     </w:rPr>
   </w:style>
   <w:style w:type="character" w:customStyle="1" w:styleId="BaseNTok">
     <w:name w:val="BaseNTok"/>
     <w:basedOn w:val="VerbatimChar"/>
     <w:rPr>
-      <w:color w:val="0000cf"/>
-      <w:shd w:val="clear" w:fill="f8f8f8"/>
+      <w:color w:val="40a070"/>
     </w:rPr>
   </w:style>
   <w:style w:type="character" w:customStyle="1" w:styleId="FloatTok">
     <w:name w:val="FloatTok"/>
     <w:basedOn w:val="VerbatimChar"/>
     <w:rPr>
-      <w:color w:val="0000cf"/>
-      <w:shd w:val="clear" w:fill="f8f8f8"/>
+      <w:color w:val="40a070"/>
     </w:rPr>
   </w:style>
   <w:style w:type="character" w:customStyle="1" w:styleId="ConstantTok">
     <w:name w:val="ConstantTok"/>
     <w:basedOn w:val="VerbatimChar"/>
     <w:rPr>
-      <w:color w:val="8f5902"/>
-      <w:shd w:val="clear" w:fill="f8f8f8"/>
+      <w:color w:val="880000"/>
     </w:rPr>
   </w:style>
   <w:style w:type="character" w:customStyle="1" w:styleId="CharTok">
     <w:name w:val="CharTok"/>
     <w:basedOn w:val="VerbatimChar"/>
     <w:rPr>
-      <w:color w:val="4e9a06"/>
-      <w:shd w:val="clear" w:fill="f8f8f8"/>
+      <w:color w:val="4070a0"/>
     </w:rPr>
   </w:style>
   <w:style w:type="character" w:customStyle="1" w:styleId="SpecialCharTok">
     <w:name w:val="SpecialCharTok"/>
     <w:basedOn w:val="VerbatimChar"/>
     <w:rPr>
-      <w:b/>
-      <w:color w:val="ce5c00"/>
-      <w:shd w:val="clear" w:fill="f8f8f8"/>
+      <w:color w:val="4070a0"/>
     </w:rPr>
   </w:style>
   <w:style w:type="character" w:customStyle="1" w:styleId="StringTok">
     <w:name w:val="StringTok"/>
     <w:basedOn w:val="VerbatimChar"/>
     <w:rPr>
-      <w:color w:val="4e9a06"/>
-      <w:shd w:val="clear" w:fill="f8f8f8"/>
+      <w:color w:val="4070a0"/>
     </w:rPr>
   </w:style>
   <w:style w:type="character" w:customStyle="1" w:styleId="VerbatimStringTok">
     <w:name w:val="VerbatimStringTok"/>
     <w:basedOn w:val="VerbatimChar"/>
     <w:rPr>
-      <w:color w:val="4e9a06"/>
-      <w:shd w:val="clear" w:fill="f8f8f8"/>
+      <w:color w:val="4070a0"/>
     </w:rPr>
   </w:style>
   <w:style w:type="character" w:customStyle="1" w:styleId="SpecialStringTok">
     <w:name w:val="SpecialStringTok"/>
     <w:basedOn w:val="VerbatimChar"/>
     <w:rPr>
-      <w:color w:val="4e9a06"/>
-      <w:shd w:val="clear" w:fill="f8f8f8"/>
+      <w:color w:val="bb6688"/>
     </w:rPr>
   </w:style>
   <w:style w:type="character" w:customStyle="1" w:styleId="ImportTok">
     <w:name w:val="ImportTok"/>
     <w:basedOn w:val="VerbatimChar"/>
     <w:rPr>
-      <w:shd w:val="clear" w:fill="f8f8f8"/>
+      <w:b/>
+      <w:color w:val="008000"/>
     </w:rPr>
   </w:style>
   <w:style w:type="character" w:customStyle="1" w:styleId="CommentTok">
@@ -10151,18 +10037,15 @@
     <w:basedOn w:val="VerbatimChar"/>
     <w:rPr>
       <w:i/>
-      <w:color w:val="8f5902"/>
-      <w:shd w:val="clear" w:fill="f8f8f8"/>
+      <w:color w:val="60a0b0"/>
     </w:rPr>
   </w:style>
   <w:style w:type="character" w:customStyle="1" w:styleId="DocumentationTok">
     <w:name w:val="DocumentationTok"/>
     <w:basedOn w:val="VerbatimChar"/>
     <w:rPr>
-      <w:b/>
       <w:i/>
-      <w:color w:val="8f5902"/>
-      <w:shd w:val="clear" w:fill="f8f8f8"/>
+      <w:color w:val="ba2121"/>
     </w:rPr>
   </w:style>
   <w:style w:type="character" w:customStyle="1" w:styleId="AnnotationTok">
@@ -10171,8 +10054,7 @@
     <w:rPr>
       <w:b/>
       <w:i/>
-      <w:color w:val="8f5902"/>
-      <w:shd w:val="clear" w:fill="f8f8f8"/>
+      <w:color w:val="60a0b0"/>
     </w:rPr>
   </w:style>
   <w:style w:type="character" w:customStyle="1" w:styleId="CommentVarTok">
@@ -10181,33 +10063,28 @@
     <w:rPr>
       <w:b/>
       <w:i/>
-      <w:color w:val="8f5902"/>
-      <w:shd w:val="clear" w:fill="f8f8f8"/>
+      <w:color w:val="60a0b0"/>
     </w:rPr>
   </w:style>
   <w:style w:type="character" w:customStyle="1" w:styleId="OtherTok">
     <w:name w:val="OtherTok"/>
     <w:basedOn w:val="VerbatimChar"/>
     <w:rPr>
-      <w:color w:val="8f5902"/>
-      <w:shd w:val="clear" w:fill="f8f8f8"/>
+      <w:color w:val="007020"/>
     </w:rPr>
   </w:style>
   <w:style w:type="character" w:customStyle="1" w:styleId="FunctionTok">
     <w:name w:val="FunctionTok"/>
     <w:basedOn w:val="VerbatimChar"/>
     <w:rPr>
-      <w:b/>
-      <w:color w:val="204a87"/>
-      <w:shd w:val="clear" w:fill="f8f8f8"/>
+      <w:color w:val="06287e"/>
     </w:rPr>
   </w:style>
   <w:style w:type="character" w:customStyle="1" w:styleId="VariableTok">
     <w:name w:val="VariableTok"/>
     <w:basedOn w:val="VerbatimChar"/>
     <w:rPr>
-      <w:color w:val="000000"/>
-      <w:shd w:val="clear" w:fill="f8f8f8"/>
+      <w:color w:val="19177c"/>
     </w:rPr>
   </w:style>
   <w:style w:type="character" w:customStyle="1" w:styleId="ControlFlowTok">
@@ -10215,56 +10092,46 @@
     <w:basedOn w:val="VerbatimChar"/>
     <w:rPr>
       <w:b/>
-      <w:color w:val="204a87"/>
-      <w:shd w:val="clear" w:fill="f8f8f8"/>
+      <w:color w:val="007020"/>
     </w:rPr>
   </w:style>
   <w:style w:type="character" w:customStyle="1" w:styleId="OperatorTok">
     <w:name w:val="OperatorTok"/>
     <w:basedOn w:val="VerbatimChar"/>
     <w:rPr>
-      <w:b/>
-      <w:color w:val="ce5c00"/>
-      <w:shd w:val="clear" w:fill="f8f8f8"/>
+      <w:color w:val="666666"/>
     </w:rPr>
   </w:style>
   <w:style w:type="character" w:customStyle="1" w:styleId="BuiltInTok">
     <w:name w:val="BuiltInTok"/>
     <w:basedOn w:val="VerbatimChar"/>
     <w:rPr>
-      <w:shd w:val="clear" w:fill="f8f8f8"/>
+      <w:color w:val="008000"/>
     </w:rPr>
   </w:style>
   <w:style w:type="character" w:customStyle="1" w:styleId="ExtensionTok">
     <w:name w:val="ExtensionTok"/>
     <w:basedOn w:val="VerbatimChar"/>
-    <w:rPr>
-      <w:shd w:val="clear" w:fill="f8f8f8"/>
-    </w:rPr>
+    <w:rPr/>
   </w:style>
   <w:style w:type="character" w:customStyle="1" w:styleId="PreprocessorTok">
     <w:name w:val="PreprocessorTok"/>
     <w:basedOn w:val="VerbatimChar"/>
     <w:rPr>
-      <w:i/>
-      <w:color w:val="8f5902"/>
-      <w:shd w:val="clear" w:fill="f8f8f8"/>
+      <w:color w:val="bc7a00"/>
     </w:rPr>
   </w:style>
   <w:style w:type="character" w:customStyle="1" w:styleId="AttributeTok">
     <w:name w:val="AttributeTok"/>
     <w:basedOn w:val="VerbatimChar"/>
     <w:rPr>
-      <w:color w:val="204a87"/>
-      <w:shd w:val="clear" w:fill="f8f8f8"/>
+      <w:color w:val="7d9029"/>
     </w:rPr>
   </w:style>
   <w:style w:type="character" w:customStyle="1" w:styleId="RegionMarkerTok">
     <w:name w:val="RegionMarkerTok"/>
     <w:basedOn w:val="VerbatimChar"/>
-    <w:rPr>
-      <w:shd w:val="clear" w:fill="f8f8f8"/>
-    </w:rPr>
+    <w:rPr/>
   </w:style>
   <w:style w:type="character" w:customStyle="1" w:styleId="InformationTok">
     <w:name w:val="InformationTok"/>
@@ -10272,8 +10139,7 @@
     <w:rPr>
       <w:b/>
       <w:i/>
-      <w:color w:val="8f5902"/>
-      <w:shd w:val="clear" w:fill="f8f8f8"/>
+      <w:color w:val="60a0b0"/>
     </w:rPr>
   </w:style>
   <w:style w:type="character" w:customStyle="1" w:styleId="WarningTok">
@@ -10282,16 +10148,15 @@
     <w:rPr>
       <w:b/>
       <w:i/>
-      <w:color w:val="8f5902"/>
-      <w:shd w:val="clear" w:fill="f8f8f8"/>
+      <w:color w:val="60a0b0"/>
     </w:rPr>
   </w:style>
   <w:style w:type="character" w:customStyle="1" w:styleId="AlertTok">
     <w:name w:val="AlertTok"/>
     <w:basedOn w:val="VerbatimChar"/>
     <w:rPr>
-      <w:color w:val="ef2929"/>
-      <w:shd w:val="clear" w:fill="f8f8f8"/>
+      <w:b/>
+      <w:color w:val="ff0000"/>
     </w:rPr>
   </w:style>
   <w:style w:type="character" w:customStyle="1" w:styleId="ErrorTok">
@@ -10299,16 +10164,13 @@
     <w:basedOn w:val="VerbatimChar"/>
     <w:rPr>
       <w:b/>
-      <w:color w:val="a40000"/>
-      <w:shd w:val="clear" w:fill="f8f8f8"/>
+      <w:color w:val="ff0000"/>
     </w:rPr>
   </w:style>
   <w:style w:type="character" w:customStyle="1" w:styleId="NormalTok">
     <w:name w:val="NormalTok"/>
     <w:basedOn w:val="VerbatimChar"/>
-    <w:rPr>
-      <w:shd w:val="clear" w:fill="f8f8f8"/>
-    </w:rPr>
+    <w:rPr/>
   </w:style>
 </w:styles>
 </file>

</xml_diff>